<commit_message>
Deploy preview for PR 105 🛫
</commit_message>
<xml_diff>
--- a/pr-preview/pr-105/chapters/21-g-methods-time-varying-tracked-changes.docx
+++ b/pr-preview/pr-105/chapters/21-g-methods-time-varying-tracked-changes.docx
@@ -8009,7 +8009,7 @@
     </w:tbl>
     <w:bookmarkEnd w:id="29"/>
     <w:bookmarkEnd w:id="30"/>
-    <w:bookmarkStart w:id="53" w:name="X5213d02ceae431c016b9b9973f519954272e8be"/>
+    <w:bookmarkStart w:id="54" w:name="X5213d02ceae431c016b9b9973f519954272e8be"/>
     <w:p>
       <w:pPr>
         <w:pStyle w:val="Heading2"/>
@@ -11990,7 +11990,7 @@
         </w:tc>
       </w:tr>
     </w:tbl>
-    <w:bookmarkStart w:id="52" w:name="marginal-structural-models"/>
+    <w:bookmarkStart w:id="53" w:name="marginal-structural-models"/>
     <w:p>
       <w:pPr>
         <w:pStyle w:val="Heading3"/>
@@ -14568,215 +14568,541 @@
       </w:tr>
     </w:tbl>
     <w:p>
-      <w:pPr>
-        <w:pStyle w:val="BodyText"/>
-      </w:pPr>
-      <w:ins w:id="24" w:author="PR Preview" w:date="2024-01-01T00:00:00Z">
-        <w:r>
-          <w:t xml:space="preserve">If this marginal structural model and the model for treatment in the weights’ denominator are both correctly specified,</w:t>
-        </w:r>
-      </w:ins>
-      <w:ins w:id="24" w:author="PR Preview" w:date="2024-01-01T00:00:00Z">
-        <w:r>
-          <w:t xml:space="preserve"> </w:t>
-        </w:r>
-      </w:ins>
-      <w:ins w:id="24" w:author="PR Preview" w:date="2024-01-01T00:00:00Z">
-        <w:r>
-          <w:t xml:space="preserve">and sequential exchangeability, positivity, and consistency hold,</w:t>
-        </w:r>
-      </w:ins>
-      <w:ins w:id="24" w:author="PR Preview" w:date="2024-01-01T00:00:00Z">
-        <w:r>
-          <w:t xml:space="preserve"> </w:t>
-        </w:r>
-      </w:ins>
-      <w:ins w:id="24" w:author="PR Preview" w:date="2024-01-01T00:00:00Z">
-        <w:r>
-          <w:t xml:space="preserve">then the coefficients of</w:t>
-        </w:r>
-      </w:ins>
-      <w:ins w:id="24" w:author="PR Preview" w:date="2024-01-01T00:00:00Z">
-        <w:r>
-          <w:t xml:space="preserve"> </w:t>
-        </w:r>
-      </w:ins>
-      <m:oMath>
-        <m:r>
-          <m:rPr>
-            <m:sty m:val="p"/>
-          </m:rPr>
-          <m:t>c</m:t>
-        </m:r>
-        <m:r>
-          <m:rPr>
-            <m:sty m:val="p"/>
-          </m:rPr>
-          <m:t>u</m:t>
-        </m:r>
-        <m:r>
-          <m:rPr>
-            <m:sty m:val="p"/>
-          </m:rPr>
-          <m:t>m</m:t>
-        </m:r>
-        <m:r>
-          <m:rPr>
-            <m:sty m:val="p"/>
-          </m:rPr>
-          <m:t>(</m:t>
-        </m:r>
-        <m:acc>
-          <m:accPr>
-            <m:chr m:val="‾"/>
-          </m:accPr>
-          <m:e>
-            <m:r>
-              <m:t>A</m:t>
-            </m:r>
-          </m:e>
-        </m:acc>
-        <m:r>
-          <m:rPr>
-            <m:sty m:val="p"/>
-          </m:rPr>
-          <m:t>)</m:t>
-        </m:r>
-      </m:oMath>
-      <w:ins w:id="24" w:author="PR Preview" w:date="2024-01-01T00:00:00Z">
-        <w:r>
-          <w:t xml:space="preserve"> </w:t>
-        </w:r>
-      </w:ins>
-      <w:ins w:id="24" w:author="PR Preview" w:date="2024-01-01T00:00:00Z">
-        <w:r>
-          <w:t xml:space="preserve">and</w:t>
-        </w:r>
-      </w:ins>
-      <w:ins w:id="24" w:author="PR Preview" w:date="2024-01-01T00:00:00Z">
-        <w:r>
-          <w:t xml:space="preserve"> </w:t>
-        </w:r>
-      </w:ins>
-      <m:oMath>
-        <m:r>
-          <m:rPr>
-            <m:sty m:val="p"/>
-          </m:rPr>
-          <m:t>c</m:t>
-        </m:r>
-        <m:r>
-          <m:rPr>
-            <m:sty m:val="p"/>
-          </m:rPr>
-          <m:t>u</m:t>
-        </m:r>
-        <m:r>
-          <m:rPr>
-            <m:sty m:val="p"/>
-          </m:rPr>
-          <m:t>m</m:t>
-        </m:r>
-        <m:r>
-          <m:rPr>
-            <m:sty m:val="p"/>
-          </m:rPr>
-          <m:t>(</m:t>
-        </m:r>
-        <m:acc>
-          <m:accPr>
-            <m:chr m:val="‾"/>
-          </m:accPr>
-          <m:e>
-            <m:r>
-              <m:t>A</m:t>
-            </m:r>
-          </m:e>
-        </m:acc>
-        <m:r>
-          <m:rPr>
-            <m:sty m:val="p"/>
-          </m:rPr>
-          <m:t>)</m:t>
-        </m:r>
-        <m:r>
-          <m:t>V</m:t>
-        </m:r>
-      </m:oMath>
-      <w:ins w:id="24" w:author="PR Preview" w:date="2024-01-01T00:00:00Z">
-        <w:r>
-          <w:t xml:space="preserve"> </w:t>
-        </w:r>
-      </w:ins>
-      <w:ins w:id="24" w:author="PR Preview" w:date="2024-01-01T00:00:00Z">
-        <w:r>
-          <w:t xml:space="preserve">in the weighted fit</w:t>
-        </w:r>
-      </w:ins>
-      <w:ins w:id="24" w:author="PR Preview" w:date="2024-01-01T00:00:00Z">
-        <w:r>
-          <w:t xml:space="preserve"> </w:t>
-        </w:r>
-      </w:ins>
-      <w:ins w:id="24" w:author="PR Preview" w:date="2024-01-01T00:00:00Z">
-        <w:r>
-          <w:t xml:space="preserve">are consistent for the causal</w:t>
-        </w:r>
-      </w:ins>
-      <w:ins w:id="24" w:author="PR Preview" w:date="2024-01-01T00:00:00Z">
-        <w:r>
-          <w:t xml:space="preserve"> </w:t>
-        </w:r>
-      </w:ins>
-      <m:oMath>
-        <m:sSub>
-          <m:e>
-            <m:r>
-              <m:t>β</m:t>
-            </m:r>
-          </m:e>
-          <m:sub>
-            <m:r>
-              <m:t>1</m:t>
-            </m:r>
-          </m:sub>
-        </m:sSub>
-      </m:oMath>
-      <w:ins w:id="24" w:author="PR Preview" w:date="2024-01-01T00:00:00Z">
-        <w:r>
-          <w:t xml:space="preserve"> </w:t>
-        </w:r>
-      </w:ins>
-      <w:ins w:id="24" w:author="PR Preview" w:date="2024-01-01T00:00:00Z">
-        <w:r>
-          <w:t xml:space="preserve">and</w:t>
-        </w:r>
-      </w:ins>
-      <w:ins w:id="24" w:author="PR Preview" w:date="2024-01-01T00:00:00Z">
-        <w:r>
-          <w:t xml:space="preserve"> </w:t>
-        </w:r>
-      </w:ins>
-      <m:oMath>
-        <m:sSub>
-          <m:e>
-            <m:r>
-              <m:t>β</m:t>
-            </m:r>
-          </m:e>
-          <m:sub>
-            <m:r>
-              <m:t>3</m:t>
-            </m:r>
-          </m:sub>
-        </m:sSub>
-      </m:oMath>
-      <w:ins w:id="24" w:author="PR Preview" w:date="2024-01-01T00:00:00Z">
-        <w:r>
-          <w:t xml:space="preserve">.</w:t>
-        </w:r>
-      </w:ins>
+      <w:r>
+        <w:pict>
+          <v:rect style="width:0;height:1.5pt" o:hralign="center" o:hrstd="t" o:hr="t"/>
+        </w:pict>
+      </w:r>
     </w:p>
+    <w:tbl>
+      <w:tblPr>
+        <w:tblStyle w:val="Table"/>
+        <w:tblInd w:w="164" w:type="dxa"/>
+        <w:tblBorders>
+          <w:left w:val="single" w:sz="24" w:space="0" w:color="909090"/>
+        </w:tblBorders>
+        <w:tblCellMar>
+          <w:left w:w="0" w:type="dxa"/>
+          <w:right w:w="0" w:type="dxa"/>
+        </w:tblCellMar>
+        <w:tblLook w:firstRow="0" w:lastRow="0" w:firstColumn="0" w:lastColumn="0" w:noHBand="0" w:noVBand="0" w:val="0000"/>
+      </w:tblPr>
+      <w:tblGrid>
+        <w:gridCol w:w="7920"/>
+      </w:tblGrid>
+      <w:tr>
+        <w:trPr>
+          <w:cantSplit/>
+        </w:trPr>
+        <w:tc>
+          <w:tcPr>
+            <w:tcMar>
+              <w:left w:w="144" w:type="dxa"/>
+            </w:tcMar>
+          </w:tcPr>
+          <w:p>
+            <w:pPr>
+              <w:pStyle w:val="FirstParagraph"/>
+            </w:pPr>
+            <w:pPr>
+              <w:spacing w:before="16" w:after="64"/>
+            </w:pPr>
+          </w:p>
+          <w:bookmarkStart w:id="46" w:name="prp-msm-effect-modification-tv-wls"/>
+          <w:p>
+            <w:pPr>
+              <w:pStyle w:val="BodyText"/>
+            </w:pPr>
+            <w:r>
+              <w:rPr>
+                <w:b/>
+                <w:bCs/>
+              </w:rPr>
+              <w:t xml:space="preserve">Proposition 3 (IP weighted least squares is consistent for the effect-modification model)</w:t>
+            </w:r>
+            <w:r>
+              <w:t xml:space="preserve"> </w:t>
+            </w:r>
+            <w:r>
+              <w:t xml:space="preserve">Suppose the marginal structural model of</w:t>
+            </w:r>
+            <w:r>
+              <w:t xml:space="preserve"> </w:t>
+            </w:r>
+            <w:hyperlink w:anchor="def-msm-effect-modification-tv">
+              <w:r>
+                <w:rPr>
+                  <w:rStyle w:val="Hyperlink"/>
+                </w:rPr>
+                <w:t xml:space="preserve">Definition 6</w:t>
+              </w:r>
+            </w:hyperlink>
+            <w:r>
+              <w:t xml:space="preserve"> </w:t>
+            </w:r>
+            <w:r>
+              <w:t xml:space="preserve">is correctly specified,</w:t>
+            </w:r>
+            <w:r>
+              <w:t xml:space="preserve"> </w:t>
+            </w:r>
+            <w:r>
+              <w:t xml:space="preserve">the identifiability conditions (sequential exchangeability, positivity, and consistency) hold,</w:t>
+            </w:r>
+            <w:r>
+              <w:t xml:space="preserve"> </w:t>
+            </w:r>
+            <w:r>
+              <w:t xml:space="preserve">and</w:t>
+            </w:r>
+            <w:r>
+              <w:t xml:space="preserve"> </w:t>
+            </w:r>
+            <m:oMath>
+              <m:r>
+                <m:t>V</m:t>
+              </m:r>
+            </m:oMath>
+            <w:r>
+              <w:t xml:space="preserve"> </w:t>
+            </w:r>
+            <w:r>
+              <w:t xml:space="preserve">is a baseline variable in</w:t>
+            </w:r>
+            <w:r>
+              <w:t xml:space="preserve"> </w:t>
+            </w:r>
+            <m:oMath>
+              <m:sSub>
+                <m:e>
+                  <m:r>
+                    <m:t>L</m:t>
+                  </m:r>
+                </m:e>
+                <m:sub>
+                  <m:r>
+                    <m:t>0</m:t>
+                  </m:r>
+                </m:sub>
+              </m:sSub>
+            </m:oMath>
+            <w:r>
+              <w:t xml:space="preserve">.</w:t>
+            </w:r>
+            <w:r>
+              <w:t xml:space="preserve"> </w:t>
+            </w:r>
+            <w:r>
+              <w:t xml:space="preserve">Let</w:t>
+            </w:r>
+            <w:r>
+              <w:t xml:space="preserve"> </w:t>
+            </w:r>
+            <m:oMath>
+              <m:sSub>
+                <m:e>
+                  <m:acc>
+                    <m:accPr>
+                      <m:chr m:val="̂"/>
+                    </m:accPr>
+                    <m:e>
+                      <m:r>
+                        <m:t>β</m:t>
+                      </m:r>
+                    </m:e>
+                  </m:acc>
+                </m:e>
+                <m:sub>
+                  <m:r>
+                    <m:t>1</m:t>
+                  </m:r>
+                </m:sub>
+              </m:sSub>
+            </m:oMath>
+            <w:r>
+              <w:t xml:space="preserve"> </w:t>
+            </w:r>
+            <w:r>
+              <w:t xml:space="preserve">and</w:t>
+            </w:r>
+            <w:r>
+              <w:t xml:space="preserve"> </w:t>
+            </w:r>
+            <m:oMath>
+              <m:sSub>
+                <m:e>
+                  <m:acc>
+                    <m:accPr>
+                      <m:chr m:val="̂"/>
+                    </m:accPr>
+                    <m:e>
+                      <m:r>
+                        <m:t>β</m:t>
+                      </m:r>
+                    </m:e>
+                  </m:acc>
+                </m:e>
+                <m:sub>
+                  <m:r>
+                    <m:t>3</m:t>
+                  </m:r>
+                </m:sub>
+              </m:sSub>
+            </m:oMath>
+            <w:r>
+              <w:t xml:space="preserve"> </w:t>
+            </w:r>
+            <w:r>
+              <w:t xml:space="preserve">be the coefficients of</w:t>
+            </w:r>
+            <w:r>
+              <w:t xml:space="preserve"> </w:t>
+            </w:r>
+            <m:oMath>
+              <m:r>
+                <m:rPr>
+                  <m:sty m:val="p"/>
+                </m:rPr>
+                <m:t>c</m:t>
+              </m:r>
+              <m:r>
+                <m:rPr>
+                  <m:sty m:val="p"/>
+                </m:rPr>
+                <m:t>u</m:t>
+              </m:r>
+              <m:r>
+                <m:rPr>
+                  <m:sty m:val="p"/>
+                </m:rPr>
+                <m:t>m</m:t>
+              </m:r>
+              <m:r>
+                <m:rPr>
+                  <m:sty m:val="p"/>
+                </m:rPr>
+                <m:t>(</m:t>
+              </m:r>
+              <m:acc>
+                <m:accPr>
+                  <m:chr m:val="‾"/>
+                </m:accPr>
+                <m:e>
+                  <m:r>
+                    <m:t>A</m:t>
+                  </m:r>
+                </m:e>
+              </m:acc>
+              <m:r>
+                <m:rPr>
+                  <m:sty m:val="p"/>
+                </m:rPr>
+                <m:t>)</m:t>
+              </m:r>
+            </m:oMath>
+            <w:r>
+              <w:t xml:space="preserve"> </w:t>
+            </w:r>
+            <w:r>
+              <w:t xml:space="preserve">and</w:t>
+            </w:r>
+            <w:r>
+              <w:t xml:space="preserve"> </w:t>
+            </w:r>
+            <m:oMath>
+              <m:r>
+                <m:rPr>
+                  <m:sty m:val="p"/>
+                </m:rPr>
+                <m:t>c</m:t>
+              </m:r>
+              <m:r>
+                <m:rPr>
+                  <m:sty m:val="p"/>
+                </m:rPr>
+                <m:t>u</m:t>
+              </m:r>
+              <m:r>
+                <m:rPr>
+                  <m:sty m:val="p"/>
+                </m:rPr>
+                <m:t>m</m:t>
+              </m:r>
+              <m:r>
+                <m:rPr>
+                  <m:sty m:val="p"/>
+                </m:rPr>
+                <m:t>(</m:t>
+              </m:r>
+              <m:acc>
+                <m:accPr>
+                  <m:chr m:val="‾"/>
+                </m:accPr>
+                <m:e>
+                  <m:r>
+                    <m:t>A</m:t>
+                  </m:r>
+                </m:e>
+              </m:acc>
+              <m:r>
+                <m:rPr>
+                  <m:sty m:val="p"/>
+                </m:rPr>
+                <m:t>)</m:t>
+              </m:r>
+              <m:r>
+                <m:t>V</m:t>
+              </m:r>
+            </m:oMath>
+            <w:r>
+              <w:t xml:space="preserve"> </w:t>
+            </w:r>
+            <w:r>
+              <w:t xml:space="preserve">in the fit of the associational model of</w:t>
+            </w:r>
+            <w:r>
+              <w:t xml:space="preserve"> </w:t>
+            </w:r>
+            <w:hyperlink w:anchor="def-msm-effect-modification-tv">
+              <w:r>
+                <w:rPr>
+                  <w:rStyle w:val="Hyperlink"/>
+                </w:rPr>
+                <w:t xml:space="preserve">Definition 6</w:t>
+              </w:r>
+            </w:hyperlink>
+            <w:r>
+              <w:t xml:space="preserve"> </w:t>
+            </w:r>
+            <w:r>
+              <w:t xml:space="preserve">by weighted least squares with weights</w:t>
+            </w:r>
+            <w:r>
+              <w:t xml:space="preserve"> </w:t>
+            </w:r>
+            <m:oMath>
+              <m:r>
+                <m:t>S</m:t>
+              </m:r>
+              <m:sSup>
+                <m:e>
+                  <m:r>
+                    <m:t>W</m:t>
+                  </m:r>
+                </m:e>
+                <m:sup>
+                  <m:acc>
+                    <m:accPr>
+                      <m:chr m:val="‾"/>
+                    </m:accPr>
+                    <m:e>
+                      <m:r>
+                        <m:t>A</m:t>
+                      </m:r>
+                    </m:e>
+                  </m:acc>
+                </m:sup>
+              </m:sSup>
+              <m:r>
+                <m:rPr>
+                  <m:sty m:val="p"/>
+                </m:rPr>
+                <m:t>(</m:t>
+              </m:r>
+              <m:r>
+                <m:t>V</m:t>
+              </m:r>
+              <m:r>
+                <m:rPr>
+                  <m:sty m:val="p"/>
+                </m:rPr>
+                <m:t>)</m:t>
+              </m:r>
+            </m:oMath>
+            <w:r>
+              <w:t xml:space="preserve"> </w:t>
+            </w:r>
+            <w:r>
+              <w:t xml:space="preserve">of</w:t>
+            </w:r>
+            <w:r>
+              <w:t xml:space="preserve"> </w:t>
+            </w:r>
+            <w:hyperlink w:anchor="def-msm-effect-modification-tv">
+              <w:r>
+                <w:rPr>
+                  <w:rStyle w:val="Hyperlink"/>
+                </w:rPr>
+                <w:t xml:space="preserve">Definition 6</w:t>
+              </w:r>
+            </w:hyperlink>
+            <w:r>
+              <w:t xml:space="preserve"> </w:t>
+            </w:r>
+            <w:r>
+              <w:t xml:space="preserve">or</w:t>
+            </w:r>
+            <w:r>
+              <w:t xml:space="preserve"> </w:t>
+            </w:r>
+            <m:oMath>
+              <m:sSup>
+                <m:e>
+                  <m:r>
+                    <m:t>W</m:t>
+                  </m:r>
+                </m:e>
+                <m:sup>
+                  <m:acc>
+                    <m:accPr>
+                      <m:chr m:val="‾"/>
+                    </m:accPr>
+                    <m:e>
+                      <m:r>
+                        <m:t>A</m:t>
+                      </m:r>
+                    </m:e>
+                  </m:acc>
+                </m:sup>
+              </m:sSup>
+            </m:oMath>
+            <w:r>
+              <w:t xml:space="preserve"> </w:t>
+            </w:r>
+            <w:r>
+              <w:t xml:space="preserve">of</w:t>
+            </w:r>
+            <w:r>
+              <w:t xml:space="preserve"> </w:t>
+            </w:r>
+            <w:hyperlink w:anchor="def-ipw-tv">
+              <w:r>
+                <w:rPr>
+                  <w:rStyle w:val="Hyperlink"/>
+                </w:rPr>
+                <w:t xml:space="preserve">Definition 4</w:t>
+              </w:r>
+            </w:hyperlink>
+            <w:r>
+              <w:t xml:space="preserve"> </w:t>
+            </w:r>
+            <w:r>
+              <w:t xml:space="preserve">(known, or estimated from a correctly specified model for treatment in the denominator).</w:t>
+            </w:r>
+            <w:r>
+              <w:t xml:space="preserve"> </w:t>
+            </w:r>
+            <w:r>
+              <w:t xml:space="preserve">Then</w:t>
+            </w:r>
+            <w:r>
+              <w:t xml:space="preserve"> </w:t>
+            </w:r>
+            <m:oMath>
+              <m:sSub>
+                <m:e>
+                  <m:acc>
+                    <m:accPr>
+                      <m:chr m:val="̂"/>
+                    </m:accPr>
+                    <m:e>
+                      <m:r>
+                        <m:t>β</m:t>
+                      </m:r>
+                    </m:e>
+                  </m:acc>
+                </m:e>
+                <m:sub>
+                  <m:r>
+                    <m:t>1</m:t>
+                  </m:r>
+                </m:sub>
+              </m:sSub>
+            </m:oMath>
+            <w:r>
+              <w:t xml:space="preserve"> </w:t>
+            </w:r>
+            <w:r>
+              <w:t xml:space="preserve">and</w:t>
+            </w:r>
+            <w:r>
+              <w:t xml:space="preserve"> </w:t>
+            </w:r>
+            <m:oMath>
+              <m:sSub>
+                <m:e>
+                  <m:acc>
+                    <m:accPr>
+                      <m:chr m:val="̂"/>
+                    </m:accPr>
+                    <m:e>
+                      <m:r>
+                        <m:t>β</m:t>
+                      </m:r>
+                    </m:e>
+                  </m:acc>
+                </m:e>
+                <m:sub>
+                  <m:r>
+                    <m:t>3</m:t>
+                  </m:r>
+                </m:sub>
+              </m:sSub>
+            </m:oMath>
+            <w:r>
+              <w:t xml:space="preserve"> </w:t>
+            </w:r>
+            <w:r>
+              <w:t xml:space="preserve">are consistent for the causal</w:t>
+            </w:r>
+            <w:r>
+              <w:t xml:space="preserve"> </w:t>
+            </w:r>
+            <m:oMath>
+              <m:sSub>
+                <m:e>
+                  <m:r>
+                    <m:t>β</m:t>
+                  </m:r>
+                </m:e>
+                <m:sub>
+                  <m:r>
+                    <m:t>1</m:t>
+                  </m:r>
+                </m:sub>
+              </m:sSub>
+            </m:oMath>
+            <w:r>
+              <w:t xml:space="preserve"> </w:t>
+            </w:r>
+            <w:r>
+              <w:t xml:space="preserve">and</w:t>
+            </w:r>
+            <w:r>
+              <w:t xml:space="preserve"> </w:t>
+            </w:r>
+            <m:oMath>
+              <m:sSub>
+                <m:e>
+                  <m:r>
+                    <m:t>β</m:t>
+                  </m:r>
+                </m:e>
+                <m:sub>
+                  <m:r>
+                    <m:t>3</m:t>
+                  </m:r>
+                </m:sub>
+              </m:sSub>
+            </m:oMath>
+            <w:r>
+              <w:t xml:space="preserve">.</w:t>
+            </w:r>
+          </w:p>
+          <w:bookmarkEnd w:id="46"/>
+        </w:tc>
+      </w:tr>
+    </w:tbl>
     <w:tbl>
       <w:tblPr>
         <w:tblStyle w:val="Table"/>
@@ -14818,12 +15144,12 @@
                 <wp:inline>
                   <wp:extent cx="152400" cy="152400"/>
                   <wp:effectExtent b="0" l="0" r="0" t="0"/>
-                  <wp:docPr descr="" title="" id="46" name="Picture"/>
+                  <wp:docPr descr="" title="" id="47" name="Picture"/>
                   <a:graphic>
                     <a:graphicData uri="http://schemas.openxmlformats.org/drawingml/2006/picture">
                       <pic:pic>
                         <pic:nvPicPr>
-                          <pic:cNvPr descr="/opt/quarto/share/formats/docx/warning.png" id="47" name="Picture"/>
+                          <pic:cNvPr descr="/opt/quarto/share/formats/docx/warning.png" id="48" name="Picture"/>
                           <pic:cNvPicPr>
                             <a:picLocks noChangeArrowheads="1" noChangeAspect="1"/>
                           </pic:cNvPicPr>
@@ -15181,12 +15507,12 @@
                 <wp:inline>
                   <wp:extent cx="152400" cy="152400"/>
                   <wp:effectExtent b="0" l="0" r="0" t="0"/>
-                  <wp:docPr descr="" title="" id="48" name="Picture"/>
+                  <wp:docPr descr="" title="" id="49" name="Picture"/>
                   <a:graphic>
                     <a:graphicData uri="http://schemas.openxmlformats.org/drawingml/2006/picture">
                       <pic:pic>
                         <pic:nvPicPr>
-                          <pic:cNvPr descr="/opt/quarto/share/formats/docx/note.png" id="49" name="Picture"/>
+                          <pic:cNvPr descr="/opt/quarto/share/formats/docx/note.png" id="50" name="Picture"/>
                           <pic:cNvPicPr>
                             <a:picLocks noChangeArrowheads="1" noChangeAspect="1"/>
                           </pic:cNvPicPr>
@@ -15383,12 +15709,12 @@
                 <wp:inline>
                   <wp:extent cx="152400" cy="152400"/>
                   <wp:effectExtent b="0" l="0" r="0" t="0"/>
-                  <wp:docPr descr="" title="" id="50" name="Picture"/>
+                  <wp:docPr descr="" title="" id="51" name="Picture"/>
                   <a:graphic>
                     <a:graphicData uri="http://schemas.openxmlformats.org/drawingml/2006/picture">
                       <pic:pic>
                         <pic:nvPicPr>
-                          <pic:cNvPr descr="/opt/quarto/share/formats/docx/note.png" id="51" name="Picture"/>
+                          <pic:cNvPr descr="/opt/quarto/share/formats/docx/note.png" id="52" name="Picture"/>
                           <pic:cNvPicPr>
                             <a:picLocks noChangeArrowheads="1" noChangeAspect="1"/>
                           </pic:cNvPicPr>
@@ -15663,9 +15989,9 @@
         </w:tc>
       </w:tr>
     </w:tbl>
-    <w:bookmarkEnd w:id="52"/>
     <w:bookmarkEnd w:id="53"/>
-    <w:bookmarkStart w:id="70" w:name="X1806f829be6aa67510f5d4ac754b76034edda8c"/>
+    <w:bookmarkEnd w:id="54"/>
+    <w:bookmarkStart w:id="71" w:name="X1806f829be6aa67510f5d4ac754b76034edda8c"/>
     <w:p>
       <w:pPr>
         <w:pStyle w:val="Heading2"/>
@@ -15715,7 +16041,7 @@
               <w:spacing w:before="16" w:after="64"/>
             </w:pPr>
           </w:p>
-          <w:bookmarkStart w:id="54" w:name="def-doubly-robust-tv"/>
+          <w:bookmarkStart w:id="55" w:name="def-doubly-robust-tv"/>
           <w:p>
             <w:pPr>
               <w:pStyle w:val="BodyText"/>
@@ -15805,11 +16131,11 @@
               <w:t xml:space="preserve">.</w:t>
             </w:r>
           </w:p>
-          <w:bookmarkEnd w:id="54"/>
+          <w:bookmarkEnd w:id="55"/>
         </w:tc>
       </w:tr>
     </w:tbl>
-    <w:bookmarkStart w:id="56" w:name="Xa4b2e9e4f93fa0382f7b91a208320f10942b615"/>
+    <w:bookmarkStart w:id="57" w:name="Xa4b2e9e4f93fa0382f7b91a208320f10942b615"/>
     <w:p>
       <w:pPr>
         <w:pStyle w:val="Heading3"/>
@@ -15818,7 +16144,7 @@
         <w:t xml:space="preserve">3.1 Review: a Doubly Robust Plug-In Estimator for a Time-Fixed Treatment</w:t>
       </w:r>
     </w:p>
-    <w:bookmarkStart w:id="55" w:name="alg-dr-time-fixed"/>
+    <w:bookmarkStart w:id="56" w:name="alg-dr-time-fixed"/>
     <w:p>
       <w:pPr>
         <w:pStyle w:val="FirstParagraph"/>
@@ -16549,9 +16875,9 @@
         <w:t xml:space="preserve">.</w:t>
       </w:r>
     </w:p>
-    <w:bookmarkEnd w:id="55"/>
     <w:bookmarkEnd w:id="56"/>
-    <w:bookmarkStart w:id="69" w:name="extension-to-time-varying-treatments"/>
+    <w:bookmarkEnd w:id="57"/>
+    <w:bookmarkStart w:id="70" w:name="extension-to-time-varying-treatments"/>
     <w:p>
       <w:pPr>
         <w:pStyle w:val="Heading3"/>
@@ -16560,7 +16886,7 @@
         <w:t xml:space="preserve">3.2 Extension to Time-Varying Treatments</w:t>
       </w:r>
     </w:p>
-    <w:bookmarkStart w:id="57" w:name="alg-dr-time-varying"/>
+    <w:bookmarkStart w:id="58" w:name="alg-dr-time-varying"/>
     <w:p>
       <w:pPr>
         <w:pStyle w:val="FirstParagraph"/>
@@ -17657,7 +17983,7 @@
         <w:t xml:space="preserve">the difference estimates the average causal effect.</w:t>
       </w:r>
     </w:p>
-    <w:bookmarkEnd w:id="57"/>
+    <w:bookmarkEnd w:id="58"/>
     <w:tbl>
       <w:tblPr>
         <w:tblStyle w:val="Table"/>
@@ -17699,12 +18025,12 @@
                 <wp:inline>
                   <wp:extent cx="152400" cy="152400"/>
                   <wp:effectExtent b="0" l="0" r="0" t="0"/>
-                  <wp:docPr descr="" title="" id="58" name="Picture"/>
+                  <wp:docPr descr="" title="" id="59" name="Picture"/>
                   <a:graphic>
                     <a:graphicData uri="http://schemas.openxmlformats.org/drawingml/2006/picture">
                       <pic:pic>
                         <pic:nvPicPr>
-                          <pic:cNvPr descr="/opt/quarto/share/formats/docx/tip.png" id="59" name="Picture"/>
+                          <pic:cNvPr descr="/opt/quarto/share/formats/docx/tip.png" id="60" name="Picture"/>
                           <pic:cNvPicPr>
                             <a:picLocks noChangeArrowheads="1" noChangeAspect="1"/>
                           </pic:cNvPicPr>
@@ -18120,7 +18446,7 @@
               <w:spacing w:before="16" w:after="64"/>
             </w:pPr>
           </w:p>
-          <w:bookmarkStart w:id="60" w:name="prp-dr-k-plus-2-robust"/>
+          <w:bookmarkStart w:id="61" w:name="prp-dr-k-plus-2-robust"/>
           <w:p>
             <w:pPr>
               <w:pStyle w:val="BodyText"/>
@@ -18130,7 +18456,7 @@
                 <w:b/>
                 <w:bCs/>
               </w:rPr>
-              <w:t xml:space="preserve">Proposition 3 (The time-varying doubly robust estimator is</w:t>
+              <w:t xml:space="preserve">Proposition 4 (The time-varying doubly robust estimator is</w:t>
             </w:r>
             <w:r>
               <w:rPr>
@@ -18926,7 +19252,7 @@
               <w:t xml:space="preserve">so the estimator is consistent for the counterfactual mean.</w:t>
             </w:r>
           </w:p>
-          <w:bookmarkEnd w:id="60"/>
+          <w:bookmarkEnd w:id="61"/>
         </w:tc>
       </w:tr>
     </w:tbl>
@@ -18981,12 +19307,12 @@
                 <wp:inline>
                   <wp:extent cx="152400" cy="152400"/>
                   <wp:effectExtent b="0" l="0" r="0" t="0"/>
-                  <wp:docPr descr="" title="" id="61" name="Picture"/>
+                  <wp:docPr descr="" title="" id="62" name="Picture"/>
                   <a:graphic>
                     <a:graphicData uri="http://schemas.openxmlformats.org/drawingml/2006/picture">
                       <pic:pic>
                         <pic:nvPicPr>
-                          <pic:cNvPr descr="/opt/quarto/share/formats/docx/note.png" id="62" name="Picture"/>
+                          <pic:cNvPr descr="/opt/quarto/share/formats/docx/note.png" id="63" name="Picture"/>
                           <pic:cNvPicPr>
                             <a:picLocks noChangeArrowheads="1" noChangeAspect="1"/>
                           </pic:cNvPicPr>
@@ -20592,12 +20918,12 @@
                 <wp:inline>
                   <wp:extent cx="152400" cy="152400"/>
                   <wp:effectExtent b="0" l="0" r="0" t="0"/>
-                  <wp:docPr descr="" title="" id="63" name="Picture"/>
+                  <wp:docPr descr="" title="" id="64" name="Picture"/>
                   <a:graphic>
                     <a:graphicData uri="http://schemas.openxmlformats.org/drawingml/2006/picture">
                       <pic:pic>
                         <pic:nvPicPr>
-                          <pic:cNvPr descr="/opt/quarto/share/formats/docx/warning.png" id="64" name="Picture"/>
+                          <pic:cNvPr descr="/opt/quarto/share/formats/docx/warning.png" id="65" name="Picture"/>
                           <pic:cNvPicPr>
                             <a:picLocks noChangeArrowheads="1" noChangeAspect="1"/>
                           </pic:cNvPicPr>
@@ -21728,12 +22054,12 @@
                 <wp:inline>
                   <wp:extent cx="152400" cy="152400"/>
                   <wp:effectExtent b="0" l="0" r="0" t="0"/>
-                  <wp:docPr descr="" title="" id="65" name="Picture"/>
+                  <wp:docPr descr="" title="" id="66" name="Picture"/>
                   <a:graphic>
                     <a:graphicData uri="http://schemas.openxmlformats.org/drawingml/2006/picture">
                       <pic:pic>
                         <pic:nvPicPr>
-                          <pic:cNvPr descr="/opt/quarto/share/formats/docx/note.png" id="66" name="Picture"/>
+                          <pic:cNvPr descr="/opt/quarto/share/formats/docx/note.png" id="67" name="Picture"/>
                           <pic:cNvPicPr>
                             <a:picLocks noChangeArrowheads="1" noChangeAspect="1"/>
                           </pic:cNvPicPr>
@@ -21901,12 +22227,12 @@
                 <wp:inline>
                   <wp:extent cx="152400" cy="152400"/>
                   <wp:effectExtent b="0" l="0" r="0" t="0"/>
-                  <wp:docPr descr="" title="" id="67" name="Picture"/>
+                  <wp:docPr descr="" title="" id="68" name="Picture"/>
                   <a:graphic>
                     <a:graphicData uri="http://schemas.openxmlformats.org/drawingml/2006/picture">
                       <pic:pic>
                         <pic:nvPicPr>
-                          <pic:cNvPr descr="/opt/quarto/share/formats/docx/note.png" id="68" name="Picture"/>
+                          <pic:cNvPr descr="/opt/quarto/share/formats/docx/note.png" id="69" name="Picture"/>
                           <pic:cNvPicPr>
                             <a:picLocks noChangeArrowheads="1" noChangeAspect="1"/>
                           </pic:cNvPicPr>
@@ -22045,9 +22371,9 @@
         </w:tc>
       </w:tr>
     </w:tbl>
-    <w:bookmarkEnd w:id="69"/>
     <w:bookmarkEnd w:id="70"/>
-    <w:bookmarkStart w:id="97" w:name="X422b10724a65f12ab6b199dc6bfb25ef871efc9"/>
+    <w:bookmarkEnd w:id="71"/>
+    <w:bookmarkStart w:id="98" w:name="X422b10724a65f12ab6b199dc6bfb25ef871efc9"/>
     <w:p>
       <w:pPr>
         <w:pStyle w:val="Heading2"/>
@@ -22097,7 +22423,7 @@
               <w:spacing w:before="16" w:after="64"/>
             </w:pPr>
           </w:p>
-          <w:bookmarkStart w:id="71" w:name="def-snmm-tv"/>
+          <w:bookmarkStart w:id="72" w:name="def-snmm-tv"/>
           <w:p>
             <w:pPr>
               <w:pStyle w:val="BodyText"/>
@@ -23165,7 +23491,7 @@
               <w:t xml:space="preserve">is the unknown true value of that parameter.</w:t>
             </w:r>
           </w:p>
-          <w:bookmarkEnd w:id="71"/>
+          <w:bookmarkEnd w:id="72"/>
         </w:tc>
       </w:tr>
     </w:tbl>
@@ -23213,7 +23539,7 @@
               <w:spacing w:before="16" w:after="64"/>
             </w:pPr>
           </w:p>
-          <w:bookmarkStart w:id="72" w:name="rem-snmm-last-blip"/>
+          <w:bookmarkStart w:id="73" w:name="rem-snmm-last-blip"/>
           <w:p>
             <w:pPr>
               <w:pStyle w:val="BodyText"/>
@@ -23384,7 +23710,7 @@
               <w:t xml:space="preserve">.</w:t>
             </w:r>
           </w:p>
-          <w:bookmarkEnd w:id="72"/>
+          <w:bookmarkEnd w:id="73"/>
         </w:tc>
       </w:tr>
     </w:tbl>
@@ -23429,7 +23755,7 @@
               <w:spacing w:before="16" w:after="64"/>
             </w:pPr>
           </w:p>
-          <w:bookmarkStart w:id="73" w:name="exm-snmm-saturated-two-times"/>
+          <w:bookmarkStart w:id="74" w:name="exm-snmm-saturated-two-times"/>
           <w:p>
             <w:pPr>
               <w:pStyle w:val="BodyText"/>
@@ -24288,7 +24614,7 @@
               <w:t xml:space="preserve">can be dropped from the conditioning events.</w:t>
             </w:r>
           </w:p>
-          <w:bookmarkEnd w:id="73"/>
+          <w:bookmarkEnd w:id="74"/>
         </w:tc>
       </w:tr>
     </w:tbl>
@@ -24991,7 +25317,7 @@
               <w:spacing w:before="16" w:after="64"/>
             </w:pPr>
           </w:p>
-          <w:bookmarkStart w:id="74" w:name="def-rank-preserving-snmm-tv"/>
+          <w:bookmarkStart w:id="75" w:name="def-rank-preserving-snmm-tv"/>
           <w:p>
             <w:pPr>
               <w:pStyle w:val="BodyText"/>
@@ -25542,7 +25868,7 @@
               <w:t xml:space="preserve">.</w:t>
             </w:r>
           </w:p>
-          <w:bookmarkEnd w:id="74"/>
+          <w:bookmarkEnd w:id="75"/>
         </w:tc>
       </w:tr>
     </w:tbl>
@@ -25597,12 +25923,12 @@
                 <wp:inline>
                   <wp:extent cx="152400" cy="152400"/>
                   <wp:effectExtent b="0" l="0" r="0" t="0"/>
-                  <wp:docPr descr="" title="" id="75" name="Picture"/>
+                  <wp:docPr descr="" title="" id="76" name="Picture"/>
                   <a:graphic>
                     <a:graphicData uri="http://schemas.openxmlformats.org/drawingml/2006/picture">
                       <pic:pic>
                         <pic:nvPicPr>
-                          <pic:cNvPr descr="/opt/quarto/share/formats/docx/warning.png" id="76" name="Picture"/>
+                          <pic:cNvPr descr="/opt/quarto/share/formats/docx/warning.png" id="77" name="Picture"/>
                           <pic:cNvPicPr>
                             <a:picLocks noChangeArrowheads="1" noChangeAspect="1"/>
                           </pic:cNvPicPr>
@@ -25811,7 +26137,7 @@
               <w:spacing w:before="16" w:after="64"/>
             </w:pPr>
           </w:p>
-          <w:bookmarkStart w:id="77" w:name="def-candidate-counterfactuals-tv"/>
+          <w:bookmarkStart w:id="78" w:name="def-candidate-counterfactuals-tv"/>
           <w:p>
             <w:pPr>
               <w:pStyle w:val="BodyText"/>
@@ -26416,7 +26742,7 @@
               </m:oMath>
             </m:oMathPara>
           </w:p>
-          <w:bookmarkEnd w:id="77"/>
+          <w:bookmarkEnd w:id="78"/>
         </w:tc>
       </w:tr>
     </w:tbl>
@@ -26464,7 +26790,7 @@
               <w:spacing w:before="16" w:after="64"/>
             </w:pPr>
           </w:p>
-          <w:bookmarkStart w:id="78" w:name="rem-candidate-counterfactuals-true-psi"/>
+          <w:bookmarkStart w:id="79" w:name="rem-candidate-counterfactuals-true-psi"/>
           <w:p>
             <w:pPr>
               <w:pStyle w:val="BodyText"/>
@@ -26731,7 +27057,7 @@
               <w:t xml:space="preserve">given the past.</w:t>
             </w:r>
           </w:p>
-          <w:bookmarkEnd w:id="78"/>
+          <w:bookmarkEnd w:id="79"/>
         </w:tc>
       </w:tr>
     </w:tbl>
@@ -26776,7 +27102,7 @@
               <w:spacing w:before="16" w:after="64"/>
             </w:pPr>
           </w:p>
-          <w:bookmarkStart w:id="79" w:name="exm-g-estimation-saturated"/>
+          <w:bookmarkStart w:id="80" w:name="exm-g-estimation-saturated"/>
           <w:p>
             <w:pPr>
               <w:pStyle w:val="BodyText"/>
@@ -28597,11 +28923,11 @@
               <w:t xml:space="preserve">.</w:t>
             </w:r>
           </w:p>
-          <w:bookmarkEnd w:id="79"/>
+          <w:bookmarkEnd w:id="80"/>
         </w:tc>
       </w:tr>
     </w:tbl>
-    <w:bookmarkStart w:id="85" w:name="general-structural-nested-mean-models"/>
+    <w:bookmarkStart w:id="86" w:name="general-structural-nested-mean-models"/>
     <w:p>
       <w:pPr>
         <w:pStyle w:val="Heading3"/>
@@ -28644,7 +28970,7 @@
               <w:spacing w:before="16" w:after="64"/>
             </w:pPr>
           </w:p>
-          <w:bookmarkStart w:id="80" w:name="def-candidate-counterfactuals-snmm"/>
+          <w:bookmarkStart w:id="81" w:name="def-candidate-counterfactuals-snmm"/>
           <w:p>
             <w:pPr>
               <w:pStyle w:val="BodyText"/>
@@ -28875,7 +29201,7 @@
               </m:oMath>
             </m:oMathPara>
           </w:p>
-          <w:bookmarkEnd w:id="80"/>
+          <w:bookmarkEnd w:id="81"/>
         </w:tc>
       </w:tr>
     </w:tbl>
@@ -28913,7 +29239,7 @@
               <w:spacing w:before="16" w:after="64"/>
             </w:pPr>
           </w:p>
-          <w:bookmarkStart w:id="81" w:name="prp-snmm-h-mean"/>
+          <w:bookmarkStart w:id="82" w:name="prp-snmm-h-mean"/>
           <w:p>
             <w:pPr>
               <w:pStyle w:val="BodyText"/>
@@ -28923,7 +29249,7 @@
                 <w:b/>
                 <w:bCs/>
               </w:rPr>
-              <w:t xml:space="preserve">Proposition 4 (Mean of the candidate counterfactuals at the true parameter)</w:t>
+              <w:t xml:space="preserve">Proposition 5 (Mean of the candidate counterfactuals at the true parameter)</w:t>
             </w:r>
             <w:r>
               <w:t xml:space="preserve"> </w:t>
@@ -29422,7 +29748,7 @@
               <w:t xml:space="preserve">.</w:t>
             </w:r>
           </w:p>
-          <w:bookmarkEnd w:id="81"/>
+          <w:bookmarkEnd w:id="82"/>
         </w:tc>
       </w:tr>
     </w:tbl>
@@ -29470,7 +29796,7 @@
               <w:spacing w:before="16" w:after="64"/>
             </w:pPr>
           </w:p>
-          <w:bookmarkStart w:id="82" w:name="exm-blip-functions"/>
+          <w:bookmarkStart w:id="83" w:name="exm-blip-functions"/>
           <w:p>
             <w:pPr>
               <w:pStyle w:val="BodyText"/>
@@ -29726,7 +30052,7 @@
               <w:t xml:space="preserve">(modification by the most recent treatment and covariate).</w:t>
             </w:r>
           </w:p>
-          <w:bookmarkEnd w:id="82"/>
+          <w:bookmarkEnd w:id="83"/>
         </w:tc>
       </w:tr>
     </w:tbl>
@@ -29771,12 +30097,12 @@
                 <wp:inline>
                   <wp:extent cx="152400" cy="152400"/>
                   <wp:effectExtent b="0" l="0" r="0" t="0"/>
-                  <wp:docPr descr="" title="" id="83" name="Picture"/>
+                  <wp:docPr descr="" title="" id="84" name="Picture"/>
                   <a:graphic>
                     <a:graphicData uri="http://schemas.openxmlformats.org/drawingml/2006/picture">
                       <pic:pic>
                         <pic:nvPicPr>
-                          <pic:cNvPr descr="/opt/quarto/share/formats/docx/note.png" id="84" name="Picture"/>
+                          <pic:cNvPr descr="/opt/quarto/share/formats/docx/note.png" id="85" name="Picture"/>
                           <pic:cNvPicPr>
                             <a:picLocks noChangeArrowheads="1" noChangeAspect="1"/>
                           </pic:cNvPicPr>
@@ -30167,8 +30493,8 @@
         </w:tc>
       </w:tr>
     </w:tbl>
-    <w:bookmarkEnd w:id="85"/>
-    <w:bookmarkStart w:id="90" w:name="g-estimation-algorithm-one-parameter"/>
+    <w:bookmarkEnd w:id="86"/>
+    <w:bookmarkStart w:id="91" w:name="g-estimation-algorithm-one-parameter"/>
     <w:p>
       <w:pPr>
         <w:pStyle w:val="Heading3"/>
@@ -30177,7 +30503,7 @@
         <w:t xml:space="preserve">4.2 G-Estimation Algorithm (One Parameter)</w:t>
       </w:r>
     </w:p>
-    <w:bookmarkStart w:id="86" w:name="alg-g-estimation-one-parameter"/>
+    <w:bookmarkStart w:id="87" w:name="alg-g-estimation-one-parameter"/>
     <w:p>
       <w:pPr>
         <w:pStyle w:val="FirstParagraph"/>
@@ -31216,7 +31542,7 @@
         <w:t xml:space="preserve">.</w:t>
       </w:r>
     </w:p>
-    <w:bookmarkEnd w:id="86"/>
+    <w:bookmarkEnd w:id="87"/>
     <w:p>
       <w:r>
         <w:pict>
@@ -31258,7 +31584,7 @@
               <w:spacing w:before="16" w:after="64"/>
             </w:pPr>
           </w:p>
-          <w:bookmarkStart w:id="87" w:name="rem-g-estimating-equation"/>
+          <w:bookmarkStart w:id="88" w:name="rem-g-estimating-equation"/>
           <w:p>
             <w:pPr>
               <w:pStyle w:val="BodyText"/>
@@ -31726,7 +32052,7 @@
               <w:t xml:space="preserve">.</w:t>
             </w:r>
           </w:p>
-          <w:bookmarkEnd w:id="87"/>
+          <w:bookmarkEnd w:id="88"/>
         </w:tc>
       </w:tr>
     </w:tbl>
@@ -31774,7 +32100,7 @@
               <w:spacing w:before="16" w:after="64"/>
             </w:pPr>
           </w:p>
-          <w:bookmarkStart w:id="88" w:name="prp-g-estimator-consistent"/>
+          <w:bookmarkStart w:id="89" w:name="prp-g-estimator-consistent"/>
           <w:p>
             <w:pPr>
               <w:pStyle w:val="BodyText"/>
@@ -31784,7 +32110,7 @@
                 <w:b/>
                 <w:bCs/>
               </w:rPr>
-              <w:t xml:space="preserve">Proposition 5 (Consistency of the g-estimator)</w:t>
+              <w:t xml:space="preserve">Proposition 6 (Consistency of the g-estimator)</w:t>
             </w:r>
             <w:r>
               <w:t xml:space="preserve"> </w:t>
@@ -32318,7 +32644,7 @@
               <w:t xml:space="preserve">enters the treatment model linearly (Technical Point 14.2).</w:t>
             </w:r>
           </w:p>
-          <w:bookmarkEnd w:id="88"/>
+          <w:bookmarkEnd w:id="89"/>
         </w:tc>
       </w:tr>
     </w:tbl>
@@ -32356,7 +32682,7 @@
               <w:spacing w:before="16" w:after="64"/>
             </w:pPr>
           </w:p>
-          <w:bookmarkStart w:id="89" w:name="rem-g-estimation-vector-beta"/>
+          <w:bookmarkStart w:id="90" w:name="rem-g-estimation-vector-beta"/>
           <w:p>
             <w:pPr>
               <w:pStyle w:val="BodyText"/>
@@ -33000,12 +33326,12 @@
               <w:t xml:space="preserve">.</w:t>
             </w:r>
           </w:p>
-          <w:bookmarkEnd w:id="89"/>
+          <w:bookmarkEnd w:id="90"/>
         </w:tc>
       </w:tr>
     </w:tbl>
-    <w:bookmarkEnd w:id="90"/>
-    <w:bookmarkStart w:id="96" w:name="from-hat-beta-to-counterfactual-means"/>
+    <w:bookmarkEnd w:id="91"/>
+    <w:bookmarkStart w:id="97" w:name="from-hat-beta-to-counterfactual-means"/>
     <w:p>
       <w:pPr>
         <w:pStyle w:val="Heading3"/>
@@ -33069,7 +33395,7 @@
               <w:spacing w:before="16" w:after="64"/>
             </w:pPr>
           </w:p>
-          <w:bookmarkStart w:id="91" w:name="X8fca00ea1cfaf8f988f6150a2d96e4a3091226f"/>
+          <w:bookmarkStart w:id="92" w:name="X8fca00ea1cfaf8f988f6150a2d96e4a3091226f"/>
           <w:p>
             <w:pPr>
               <w:pStyle w:val="BodyText"/>
@@ -33822,7 +34148,7 @@
               <w:t xml:space="preserve">(Technical Point 21.9).</w:t>
             </w:r>
           </w:p>
-          <w:bookmarkEnd w:id="91"/>
+          <w:bookmarkEnd w:id="92"/>
         </w:tc>
       </w:tr>
     </w:tbl>
@@ -33877,12 +34203,12 @@
                 <wp:inline>
                   <wp:extent cx="152400" cy="152400"/>
                   <wp:effectExtent b="0" l="0" r="0" t="0"/>
-                  <wp:docPr descr="" title="" id="92" name="Picture"/>
+                  <wp:docPr descr="" title="" id="93" name="Picture"/>
                   <a:graphic>
                     <a:graphicData uri="http://schemas.openxmlformats.org/drawingml/2006/picture">
                       <pic:pic>
                         <pic:nvPicPr>
-                          <pic:cNvPr descr="/opt/quarto/share/formats/docx/note.png" id="93" name="Picture"/>
+                          <pic:cNvPr descr="/opt/quarto/share/formats/docx/note.png" id="94" name="Picture"/>
                           <pic:cNvPicPr>
                             <a:picLocks noChangeArrowheads="1" noChangeAspect="1"/>
                           </pic:cNvPicPr>
@@ -34913,12 +35239,12 @@
                 <wp:inline>
                   <wp:extent cx="152400" cy="152400"/>
                   <wp:effectExtent b="0" l="0" r="0" t="0"/>
-                  <wp:docPr descr="" title="" id="94" name="Picture"/>
+                  <wp:docPr descr="" title="" id="95" name="Picture"/>
                   <a:graphic>
                     <a:graphicData uri="http://schemas.openxmlformats.org/drawingml/2006/picture">
                       <pic:pic>
                         <pic:nvPicPr>
-                          <pic:cNvPr descr="/opt/quarto/share/formats/docx/note.png" id="95" name="Picture"/>
+                          <pic:cNvPr descr="/opt/quarto/share/formats/docx/note.png" id="96" name="Picture"/>
                           <pic:cNvPicPr>
                             <a:picLocks noChangeArrowheads="1" noChangeAspect="1"/>
                           </pic:cNvPicPr>
@@ -35029,9 +35355,9 @@
         </w:tc>
       </w:tr>
     </w:tbl>
-    <w:bookmarkEnd w:id="96"/>
     <w:bookmarkEnd w:id="97"/>
-    <w:bookmarkStart w:id="113" w:name="X111dc00f3d4d68d0416f934e2acfb5e1ce06646"/>
+    <w:bookmarkEnd w:id="98"/>
+    <w:bookmarkStart w:id="114" w:name="X111dc00f3d4d68d0416f934e2acfb5e1ce06646"/>
     <w:p>
       <w:pPr>
         <w:pStyle w:val="Heading2"/>
@@ -35111,7 +35437,7 @@
               <w:spacing w:before="16" w:after="64"/>
             </w:pPr>
           </w:p>
-          <w:bookmarkStart w:id="98" w:name="def-time-varying-censoring-tv"/>
+          <w:bookmarkStart w:id="99" w:name="def-time-varying-censoring-tv"/>
           <w:p>
             <w:pPr>
               <w:pStyle w:val="BodyText"/>
@@ -35440,7 +35766,7 @@
               <w:t xml:space="preserve">so analyses are restricted to uncensored person-times.</w:t>
             </w:r>
           </w:p>
-          <w:bookmarkEnd w:id="98"/>
+          <w:bookmarkEnd w:id="99"/>
         </w:tc>
       </w:tr>
     </w:tbl>
@@ -35485,7 +35811,7 @@
               <w:spacing w:before="16" w:after="64"/>
             </w:pPr>
           </w:p>
-          <w:bookmarkStart w:id="99" w:name="def-g-formula-censoring"/>
+          <w:bookmarkStart w:id="100" w:name="def-g-formula-censoring"/>
           <w:p>
             <w:pPr>
               <w:pStyle w:val="BodyText"/>
@@ -35866,7 +36192,7 @@
               </m:oMath>
             </m:oMathPara>
           </w:p>
-          <w:bookmarkEnd w:id="99"/>
+          <w:bookmarkEnd w:id="100"/>
         </w:tc>
       </w:tr>
     </w:tbl>
@@ -35914,7 +36240,7 @@
               <w:spacing w:before="16" w:after="64"/>
             </w:pPr>
           </w:p>
-          <w:bookmarkStart w:id="100" w:name="prp-g-formula-censoring-identifies"/>
+          <w:bookmarkStart w:id="101" w:name="prp-g-formula-censoring-identifies"/>
           <w:p>
             <w:pPr>
               <w:pStyle w:val="BodyText"/>
@@ -35924,7 +36250,7 @@
                 <w:b/>
                 <w:bCs/>
               </w:rPr>
-              <w:t xml:space="preserve">Proposition 6 (The censored g-formula identifies the uncensored counterfactual mean)</w:t>
+              <w:t xml:space="preserve">Proposition 7 (The censored g-formula identifies the uncensored counterfactual mean)</w:t>
             </w:r>
             <w:r>
               <w:t xml:space="preserve"> </w:t>
@@ -36161,7 +36487,7 @@
               <w:t xml:space="preserve">and nobody been lost to follow-up.</w:t>
             </w:r>
           </w:p>
-          <w:bookmarkEnd w:id="100"/>
+          <w:bookmarkEnd w:id="101"/>
         </w:tc>
       </w:tr>
     </w:tbl>
@@ -36294,12 +36620,12 @@
                 <wp:inline>
                   <wp:extent cx="152400" cy="152400"/>
                   <wp:effectExtent b="0" l="0" r="0" t="0"/>
-                  <wp:docPr descr="" title="" id="101" name="Picture"/>
+                  <wp:docPr descr="" title="" id="102" name="Picture"/>
                   <a:graphic>
                     <a:graphicData uri="http://schemas.openxmlformats.org/drawingml/2006/picture">
                       <pic:pic>
                         <pic:nvPicPr>
-                          <pic:cNvPr descr="/opt/quarto/share/formats/docx/warning.png" id="102" name="Picture"/>
+                          <pic:cNvPr descr="/opt/quarto/share/formats/docx/warning.png" id="103" name="Picture"/>
                           <pic:cNvPicPr>
                             <a:picLocks noChangeArrowheads="1" noChangeAspect="1"/>
                           </pic:cNvPicPr>
@@ -36414,7 +36740,7 @@
         </w:tc>
       </w:tr>
     </w:tbl>
-    <w:bookmarkStart w:id="112" w:name="ip-weighting-with-censoring"/>
+    <w:bookmarkStart w:id="113" w:name="ip-weighting-with-censoring"/>
     <w:p>
       <w:pPr>
         <w:pStyle w:val="Heading3"/>
@@ -36423,7 +36749,7 @@
         <w:t xml:space="preserve">5.1 IP Weighting with Censoring</w:t>
       </w:r>
     </w:p>
-    <w:bookmarkStart w:id="103" w:name="alg-ipw-censoring-tv"/>
+    <w:bookmarkStart w:id="104" w:name="alg-ipw-censoring-tv"/>
     <w:p>
       <w:pPr>
         <w:pStyle w:val="FirstParagraph"/>
@@ -37306,7 +37632,7 @@
         <w:t xml:space="preserve">Numerator and denominator are estimated with separate logistic models.</w:t>
       </w:r>
     </w:p>
-    <w:bookmarkEnd w:id="103"/>
+    <w:bookmarkEnd w:id="104"/>
     <w:p>
       <w:r>
         <w:pict>
@@ -37348,7 +37674,7 @@
               <w:spacing w:before="16" w:after="64"/>
             </w:pPr>
           </w:p>
-          <w:bookmarkStart w:id="104" w:name="rem-censoring-pseudo-population"/>
+          <w:bookmarkStart w:id="105" w:name="rem-censoring-pseudo-population"/>
           <w:p>
             <w:pPr>
               <w:pStyle w:val="BodyText"/>
@@ -37820,7 +38146,7 @@
               <w:t xml:space="preserve">is affected by prior treatment.</w:t>
             </w:r>
           </w:p>
-          <w:bookmarkEnd w:id="104"/>
+          <w:bookmarkEnd w:id="105"/>
         </w:tc>
       </w:tr>
     </w:tbl>
@@ -37868,7 +38194,7 @@
               <w:spacing w:before="16" w:after="64"/>
             </w:pPr>
           </w:p>
-          <w:bookmarkStart w:id="105" w:name="rem-g-estimation-censoring"/>
+          <w:bookmarkStart w:id="106" w:name="rem-g-estimation-censoring"/>
           <w:p>
             <w:pPr>
               <w:pStyle w:val="BodyText"/>
@@ -37927,7 +38253,7 @@
               <w:t xml:space="preserve">a pseudo-population in which nobody is censored, then g-estimate in it.</w:t>
             </w:r>
           </w:p>
-          <w:bookmarkEnd w:id="105"/>
+          <w:bookmarkEnd w:id="106"/>
         </w:tc>
       </w:tr>
     </w:tbl>
@@ -37972,12 +38298,12 @@
                 <wp:inline>
                   <wp:extent cx="152400" cy="152400"/>
                   <wp:effectExtent b="0" l="0" r="0" t="0"/>
-                  <wp:docPr descr="" title="" id="106" name="Picture"/>
+                  <wp:docPr descr="" title="" id="107" name="Picture"/>
                   <a:graphic>
                     <a:graphicData uri="http://schemas.openxmlformats.org/drawingml/2006/picture">
                       <pic:pic>
                         <pic:nvPicPr>
-                          <pic:cNvPr descr="/opt/quarto/share/formats/docx/tip.png" id="107" name="Picture"/>
+                          <pic:cNvPr descr="/opt/quarto/share/formats/docx/tip.png" id="108" name="Picture"/>
                           <pic:cNvPicPr>
                             <a:picLocks noChangeArrowheads="1" noChangeAspect="1"/>
                           </pic:cNvPicPr>
@@ -38442,12 +38768,12 @@
                 <wp:inline>
                   <wp:extent cx="152400" cy="152400"/>
                   <wp:effectExtent b="0" l="0" r="0" t="0"/>
-                  <wp:docPr descr="" title="" id="108" name="Picture"/>
+                  <wp:docPr descr="" title="" id="109" name="Picture"/>
                   <a:graphic>
                     <a:graphicData uri="http://schemas.openxmlformats.org/drawingml/2006/picture">
                       <pic:pic>
                         <pic:nvPicPr>
-                          <pic:cNvPr descr="/opt/quarto/share/formats/docx/warning.png" id="109" name="Picture"/>
+                          <pic:cNvPr descr="/opt/quarto/share/formats/docx/warning.png" id="110" name="Picture"/>
                           <pic:cNvPicPr>
                             <a:picLocks noChangeArrowheads="1" noChangeAspect="1"/>
                           </pic:cNvPicPr>
@@ -38831,12 +39157,12 @@
                 <wp:inline>
                   <wp:extent cx="152400" cy="152400"/>
                   <wp:effectExtent b="0" l="0" r="0" t="0"/>
-                  <wp:docPr descr="" title="" id="110" name="Picture"/>
+                  <wp:docPr descr="" title="" id="111" name="Picture"/>
                   <a:graphic>
                     <a:graphicData uri="http://schemas.openxmlformats.org/drawingml/2006/picture">
                       <pic:pic>
                         <pic:nvPicPr>
-                          <pic:cNvPr descr="/opt/quarto/share/formats/docx/note.png" id="111" name="Picture"/>
+                          <pic:cNvPr descr="/opt/quarto/share/formats/docx/note.png" id="112" name="Picture"/>
                           <pic:cNvPicPr>
                             <a:picLocks noChangeArrowheads="1" noChangeAspect="1"/>
                           </pic:cNvPicPr>
@@ -39110,9 +39436,9 @@
         </w:tc>
       </w:tr>
     </w:tbl>
-    <w:bookmarkEnd w:id="112"/>
     <w:bookmarkEnd w:id="113"/>
-    <w:bookmarkStart w:id="123" w:name="the-big-g-formula-pp.-300-303"/>
+    <w:bookmarkEnd w:id="114"/>
+    <w:bookmarkStart w:id="124" w:name="the-big-g-formula-pp.-300-303"/>
     <w:p>
       <w:pPr>
         <w:pStyle w:val="Heading2"/>
@@ -39224,7 +39550,7 @@
               <w:spacing w:before="16" w:after="64"/>
             </w:pPr>
           </w:p>
-          <w:bookmarkStart w:id="114" w:name="def-big-g-formula"/>
+          <w:bookmarkStart w:id="115" w:name="def-big-g-formula"/>
           <w:p>
             <w:pPr>
               <w:pStyle w:val="BodyText"/>
@@ -39489,7 +39815,7 @@
               <w:t xml:space="preserve">.</w:t>
             </w:r>
           </w:p>
-          <w:bookmarkEnd w:id="114"/>
+          <w:bookmarkEnd w:id="115"/>
         </w:tc>
       </w:tr>
     </w:tbl>
@@ -39537,7 +39863,7 @@
               <w:spacing w:before="16" w:after="64"/>
             </w:pPr>
           </w:p>
-          <w:bookmarkStart w:id="115" w:name="def-factuals"/>
+          <w:bookmarkStart w:id="116" w:name="def-factuals"/>
           <w:p>
             <w:pPr>
               <w:pStyle w:val="BodyText"/>
@@ -39592,7 +39918,7 @@
               <w:t xml:space="preserve">.</w:t>
             </w:r>
           </w:p>
-          <w:bookmarkEnd w:id="115"/>
+          <w:bookmarkEnd w:id="116"/>
         </w:tc>
       </w:tr>
     </w:tbl>
@@ -39640,7 +39966,7 @@
               <w:spacing w:before="16" w:after="64"/>
             </w:pPr>
           </w:p>
-          <w:bookmarkStart w:id="116" w:name="rem-big-g-formula-not-computable"/>
+          <w:bookmarkStart w:id="117" w:name="rem-big-g-formula-not-computable"/>
           <w:p>
             <w:pPr>
               <w:pStyle w:val="BodyText"/>
@@ -39740,11 +40066,11 @@
               <w:t xml:space="preserve">, so it cannot be computed directly.</w:t>
             </w:r>
           </w:p>
-          <w:bookmarkEnd w:id="116"/>
+          <w:bookmarkEnd w:id="117"/>
         </w:tc>
       </w:tr>
     </w:tbl>
-    <w:bookmarkStart w:id="122" w:name="Xe5aae8025200d8a1dea52e29a48929b266456ce"/>
+    <w:bookmarkStart w:id="123" w:name="Xe5aae8025200d8a1dea52e29a48929b266456ce"/>
     <w:p>
       <w:pPr>
         <w:pStyle w:val="Heading3"/>
@@ -39787,7 +40113,7 @@
               <w:spacing w:before="16" w:after="64"/>
             </w:pPr>
           </w:p>
-          <w:bookmarkStart w:id="117" w:name="rem-reducing-big-g-formula"/>
+          <w:bookmarkStart w:id="118" w:name="rem-reducing-big-g-formula"/>
           <w:p>
             <w:pPr>
               <w:pStyle w:val="BodyText"/>
@@ -39954,7 +40280,7 @@
               <w:t xml:space="preserve">was settled by Tian and Pearl (2002), Shpitser and Pearl (2006), and Huang and Valtorta (2006).</w:t>
             </w:r>
           </w:p>
-          <w:bookmarkEnd w:id="117"/>
+          <w:bookmarkEnd w:id="118"/>
         </w:tc>
       </w:tr>
     </w:tbl>
@@ -40009,12 +40335,12 @@
                 <wp:inline>
                   <wp:extent cx="152400" cy="152400"/>
                   <wp:effectExtent b="0" l="0" r="0" t="0"/>
-                  <wp:docPr descr="" title="" id="118" name="Picture"/>
+                  <wp:docPr descr="" title="" id="119" name="Picture"/>
                   <a:graphic>
                     <a:graphicData uri="http://schemas.openxmlformats.org/drawingml/2006/picture">
                       <pic:pic>
                         <pic:nvPicPr>
-                          <pic:cNvPr descr="/opt/quarto/share/formats/docx/warning.png" id="119" name="Picture"/>
+                          <pic:cNvPr descr="/opt/quarto/share/formats/docx/warning.png" id="120" name="Picture"/>
                           <pic:cNvPicPr>
                             <a:picLocks noChangeArrowheads="1" noChangeAspect="1"/>
                           </pic:cNvPicPr>
@@ -40137,7 +40463,7 @@
               <w:spacing w:before="16" w:after="64"/>
             </w:pPr>
           </w:p>
-          <w:bookmarkStart w:id="120" w:name="exm-front-door-big-g"/>
+          <w:bookmarkStart w:id="121" w:name="exm-front-door-big-g"/>
           <w:p>
             <w:pPr>
               <w:pStyle w:val="BodyText"/>
@@ -42512,7 +42838,7 @@
               <w:t xml:space="preserve">.</w:t>
             </w:r>
           </w:p>
-          <w:bookmarkEnd w:id="120"/>
+          <w:bookmarkEnd w:id="121"/>
         </w:tc>
       </w:tr>
     </w:tbl>
@@ -42550,7 +42876,7 @@
               <w:spacing w:before="16" w:after="64"/>
             </w:pPr>
           </w:p>
-          <w:bookmarkStart w:id="121" w:name="rem-front-door-other-proofs"/>
+          <w:bookmarkStart w:id="122" w:name="rem-front-door-other-proofs"/>
           <w:p>
             <w:pPr>
               <w:pStyle w:val="BodyText"/>
@@ -42759,13 +43085,13 @@
               <w:t xml:space="preserve">.</w:t>
             </w:r>
           </w:p>
-          <w:bookmarkEnd w:id="121"/>
+          <w:bookmarkEnd w:id="122"/>
         </w:tc>
       </w:tr>
     </w:tbl>
-    <w:bookmarkEnd w:id="122"/>
     <w:bookmarkEnd w:id="123"/>
-    <w:bookmarkStart w:id="124" w:name="summary"/>
+    <w:bookmarkEnd w:id="124"/>
+    <w:bookmarkStart w:id="125" w:name="summary"/>
     <w:p>
       <w:pPr>
         <w:pStyle w:val="Heading2"/>
@@ -43455,8 +43781,8 @@
         <w:t xml:space="preserve">other identifying formulas, such as the front door formula, are reductions of it to observed data.</w:t>
       </w:r>
     </w:p>
-    <w:bookmarkEnd w:id="124"/>
-    <w:bookmarkStart w:id="128" w:name="references"/>
+    <w:bookmarkEnd w:id="125"/>
+    <w:bookmarkStart w:id="129" w:name="references"/>
     <w:p>
       <w:pPr>
         <w:pStyle w:val="Heading2"/>
@@ -43472,8 +43798,8 @@
         </w:pict>
       </w:r>
     </w:p>
-    <w:bookmarkStart w:id="127" w:name="refs"/>
-    <w:bookmarkStart w:id="126" w:name="ref-hernan2020causal"/>
+    <w:bookmarkStart w:id="128" w:name="refs"/>
+    <w:bookmarkStart w:id="127" w:name="ref-hernan2020causal"/>
     <w:p>
       <w:pPr>
         <w:pStyle w:val="Bibliography"/>
@@ -43497,7 +43823,7 @@
       <w:r>
         <w:t xml:space="preserve"> </w:t>
       </w:r>
-      <w:hyperlink r:id="rId125">
+      <w:hyperlink r:id="rId126">
         <w:r>
           <w:rPr>
             <w:rStyle w:val="Hyperlink"/>
@@ -43509,9 +43835,9 @@
         <w:t xml:space="preserve">.</w:t>
       </w:r>
     </w:p>
-    <w:bookmarkEnd w:id="126"/>
     <w:bookmarkEnd w:id="127"/>
     <w:bookmarkEnd w:id="128"/>
+    <w:bookmarkEnd w:id="129"/>
     <w:sectPr>
       <w:footnotePr>
         <w:numRestart w:val="eachSect"/>

</xml_diff>